<commit_message>
bugfixes added "help" command to list all commands
</commit_message>
<xml_diff>
--- a/receiver/manual receiver.docx
+++ b/receiver/manual receiver.docx
@@ -71,21 +71,7 @@
         <w:rPr>
           <w:lang w:val="en-GB"/>
         </w:rPr>
-        <w:t xml:space="preserve">d an additional </w:t>
-      </w:r>
-      <w:proofErr w:type="spellStart"/>
-      <w:r>
-        <w:rPr>
-          <w:lang w:val="en-GB"/>
-        </w:rPr>
-        <w:t>Meshtastic</w:t>
-      </w:r>
-      <w:proofErr w:type="spellEnd"/>
-      <w:r>
-        <w:rPr>
-          <w:lang w:val="en-GB"/>
-        </w:rPr>
-        <w:t xml:space="preserve"> node</w:t>
+        <w:t>d an additional Meshtastic node</w:t>
       </w:r>
       <w:r>
         <w:rPr>
@@ -103,21 +89,7 @@
         <w:rPr>
           <w:lang w:val="en-GB"/>
         </w:rPr>
-        <w:t>“</w:t>
-      </w:r>
-      <w:proofErr w:type="spellStart"/>
-      <w:r>
-        <w:rPr>
-          <w:lang w:val="en-GB"/>
-        </w:rPr>
-        <w:t>api</w:t>
-      </w:r>
-      <w:proofErr w:type="spellEnd"/>
-      <w:r>
-        <w:rPr>
-          <w:lang w:val="en-GB"/>
-        </w:rPr>
-        <w:t>”</w:t>
+        <w:t>“api”</w:t>
       </w:r>
       <w:r>
         <w:rPr>
@@ -163,21 +135,7 @@
         <w:rPr>
           <w:lang w:val="en-GB"/>
         </w:rPr>
-        <w:t xml:space="preserve"> </w:t>
-      </w:r>
-      <w:proofErr w:type="spellStart"/>
-      <w:r>
-        <w:rPr>
-          <w:lang w:val="en-GB"/>
-        </w:rPr>
-        <w:t>Wifi</w:t>
-      </w:r>
-      <w:proofErr w:type="spellEnd"/>
-      <w:r>
-        <w:rPr>
-          <w:lang w:val="en-GB"/>
-        </w:rPr>
-        <w:t xml:space="preserve"> Ac</w:t>
+        <w:t xml:space="preserve"> Wifi Ac</w:t>
       </w:r>
       <w:r>
         <w:rPr>
@@ -208,24 +166,15 @@
           <w:highlight w:val="yellow"/>
           <w:lang w:val="en-GB"/>
         </w:rPr>
-        <w:t xml:space="preserve">SSID: </w:t>
-      </w:r>
-      <w:proofErr w:type="spellStart"/>
+        <w:t>SSID: MeshBee</w:t>
+      </w:r>
       <w:r>
         <w:rPr>
           <w:highlight w:val="yellow"/>
           <w:lang w:val="en-GB"/>
         </w:rPr>
-        <w:t>MeshBee</w:t>
-      </w:r>
-      <w:r>
-        <w:rPr>
-          <w:highlight w:val="yellow"/>
-          <w:lang w:val="en-GB"/>
-        </w:rPr>
         <w:t>R</w:t>
       </w:r>
-      <w:proofErr w:type="spellEnd"/>
       <w:r>
         <w:rPr>
           <w:highlight w:val="yellow"/>
@@ -290,30 +239,8 @@
         <w:rPr>
           <w:lang w:val="en-GB"/>
         </w:rPr>
-        <w:t xml:space="preserve"> </w:t>
-      </w:r>
-      <w:proofErr w:type="spellStart"/>
-      <w:r>
-        <w:rPr>
-          <w:lang w:val="en-GB"/>
-        </w:rPr>
-        <w:t>WiFi</w:t>
-      </w:r>
-      <w:proofErr w:type="spellEnd"/>
-      <w:r>
-        <w:rPr>
-          <w:lang w:val="en-GB"/>
-        </w:rPr>
-        <w:t xml:space="preserve"> </w:t>
-      </w:r>
-      <w:proofErr w:type="spellStart"/>
-      <w:r>
-        <w:rPr>
-          <w:lang w:val="en-GB"/>
-        </w:rPr>
-        <w:t>Meshbee</w:t>
-      </w:r>
-      <w:proofErr w:type="spellEnd"/>
+        <w:t xml:space="preserve"> WiFi Meshbee</w:t>
+      </w:r>
       <w:r>
         <w:rPr>
           <w:lang w:val="en-GB"/>
@@ -491,21 +418,7 @@
         <w:rPr>
           <w:lang w:val="en-GB"/>
         </w:rPr>
-        <w:t>&lt;</w:t>
-      </w:r>
-      <w:proofErr w:type="spellStart"/>
-      <w:r>
-        <w:rPr>
-          <w:lang w:val="en-GB"/>
-        </w:rPr>
-        <w:t>xyz</w:t>
-      </w:r>
-      <w:proofErr w:type="spellEnd"/>
-      <w:r>
-        <w:rPr>
-          <w:lang w:val="en-GB"/>
-        </w:rPr>
-        <w:t>&gt;</w:t>
+        <w:t>&lt;xyz&gt;</w:t>
       </w:r>
       <w:r>
         <w:rPr>
@@ -598,17 +511,8 @@
           <w:highlight w:val="yellow"/>
           <w:lang w:val="en-GB"/>
         </w:rPr>
-        <w:t>192.168.4.1/</w:t>
-      </w:r>
-      <w:proofErr w:type="spellStart"/>
-      <w:r>
-        <w:rPr>
-          <w:highlight w:val="yellow"/>
-          <w:lang w:val="en-GB"/>
-        </w:rPr>
-        <w:t>webserial</w:t>
-      </w:r>
-      <w:proofErr w:type="spellEnd"/>
+        <w:t>192.168.4.1/webserial</w:t>
+      </w:r>
     </w:p>
     <w:p>
       <w:pPr>
@@ -633,19 +537,7 @@
         <w:rPr>
           <w:lang w:val="en-GB"/>
         </w:rPr>
-        <w:t>com</w:t>
-      </w:r>
-      <w:r>
-        <w:rPr>
-          <w:lang w:val="en-GB"/>
-        </w:rPr>
-        <w:t>m</w:t>
-      </w:r>
-      <w:r>
-        <w:rPr>
-          <w:lang w:val="en-GB"/>
-        </w:rPr>
-        <w:t>and:</w:t>
+        <w:t>command:</w:t>
       </w:r>
       <w:r>
         <w:rPr>
@@ -662,11 +554,6 @@
           <w:lang w:val="en-GB"/>
         </w:rPr>
         <w:br/>
-      </w:r>
-      <w:r>
-        <w:rPr>
-          <w:lang w:val="en-GB"/>
-        </w:rPr>
         <w:t>lists all s</w:t>
       </w:r>
       <w:r>
@@ -700,19 +587,7 @@
         <w:rPr>
           <w:lang w:val="en-GB"/>
         </w:rPr>
-        <w:t>com</w:t>
-      </w:r>
-      <w:r>
-        <w:rPr>
-          <w:lang w:val="en-GB"/>
-        </w:rPr>
-        <w:t>m</w:t>
-      </w:r>
-      <w:r>
-        <w:rPr>
-          <w:lang w:val="en-GB"/>
-        </w:rPr>
-        <w:t>and:</w:t>
+        <w:t>command:</w:t>
       </w:r>
       <w:r>
         <w:rPr>
@@ -722,7 +597,7 @@
           <w:szCs w:val="28"/>
           <w:lang w:val="en-GB"/>
         </w:rPr>
-        <w:t xml:space="preserve"> ex</w:t>
+        <w:t xml:space="preserve"> </w:t>
       </w:r>
       <w:r>
         <w:rPr>
@@ -732,319 +607,20 @@
           <w:szCs w:val="28"/>
           <w:lang w:val="en-GB"/>
         </w:rPr>
-        <w:t>ample</w:t>
-      </w:r>
-      <w:r>
-        <w:rPr>
-          <w:b/>
-          <w:bCs/>
-          <w:sz w:val="28"/>
-          <w:szCs w:val="28"/>
-          <w:lang w:val="en-GB"/>
-        </w:rPr>
-        <w:t xml:space="preserve"> </w:t>
-      </w:r>
-      <w:r>
-        <w:rPr>
-          <w:lang w:val="en-GB"/>
-        </w:rPr>
-        <w:t xml:space="preserve">(example </w:t>
-      </w:r>
-      <w:r>
-        <w:rPr>
-          <w:lang w:val="en-GB"/>
-        </w:rPr>
-        <w:t>node ID</w:t>
-      </w:r>
-      <w:r>
-        <w:rPr>
-          <w:lang w:val="en-GB"/>
-        </w:rPr>
-        <w:t>)</w:t>
-      </w:r>
-      <w:r>
-        <w:rPr>
-          <w:b/>
-          <w:bCs/>
+        <w:t>help</w:t>
+      </w:r>
+      <w:r>
+        <w:rPr>
           <w:lang w:val="en-GB"/>
         </w:rPr>
         <w:br/>
-      </w:r>
-      <w:r>
-        <w:rPr>
-          <w:lang w:val="en-GB"/>
-        </w:rPr>
-        <w:t xml:space="preserve">shows an example of </w:t>
-      </w:r>
-      <w:r>
-        <w:rPr>
-          <w:lang w:val="en-GB"/>
-        </w:rPr>
-        <w:t>the configuration of a node ID</w:t>
-      </w:r>
-      <w:r>
-        <w:rPr>
-          <w:lang w:val="en-GB"/>
-        </w:rPr>
-        <w:t xml:space="preserve">. </w:t>
-      </w:r>
-      <w:r>
-        <w:rPr>
-          <w:lang w:val="en-GB"/>
-        </w:rPr>
-        <w:t>Watch below</w:t>
-      </w:r>
-      <w:r>
-        <w:rPr>
-          <w:lang w:val="en-GB"/>
-        </w:rPr>
-        <w:t>.</w:t>
-      </w:r>
-      <w:r>
-        <w:rPr>
-          <w:lang w:val="en-GB"/>
-        </w:rPr>
-        <w:br/>
-      </w:r>
-    </w:p>
-    <w:p>
-      <w:pPr>
-        <w:pStyle w:val="Listenabsatz"/>
-        <w:numPr>
-          <w:ilvl w:val="1"/>
-          <w:numId w:val="1"/>
-        </w:numPr>
-        <w:rPr>
-          <w:lang w:val="en-GB"/>
-        </w:rPr>
-      </w:pPr>
-      <w:r>
-        <w:rPr>
-          <w:lang w:val="en-GB"/>
-        </w:rPr>
-        <w:t>command:</w:t>
-      </w:r>
-      <w:r>
-        <w:rPr>
-          <w:b/>
-          <w:bCs/>
-          <w:sz w:val="28"/>
-          <w:szCs w:val="28"/>
-          <w:lang w:val="en-GB"/>
-        </w:rPr>
-        <w:t xml:space="preserve"> reset</w:t>
-      </w:r>
-      <w:r>
-        <w:rPr>
-          <w:b/>
-          <w:bCs/>
-          <w:lang w:val="en-GB"/>
-        </w:rPr>
-        <w:br/>
-      </w:r>
-      <w:r>
-        <w:rPr>
-          <w:lang w:val="en-GB"/>
-        </w:rPr>
-        <w:t xml:space="preserve">resets </w:t>
-      </w:r>
-      <w:r>
-        <w:rPr>
-          <w:lang w:val="en-GB"/>
-        </w:rPr>
-        <w:t>the receiver</w:t>
-      </w:r>
-      <w:r>
-        <w:rPr>
-          <w:lang w:val="en-GB"/>
-        </w:rPr>
-        <w:t xml:space="preserve"> </w:t>
-      </w:r>
-      <w:r>
-        <w:rPr>
-          <w:lang w:val="en-GB"/>
-        </w:rPr>
-        <w:br/>
-      </w:r>
-    </w:p>
-    <w:p>
-      <w:pPr>
-        <w:pStyle w:val="Listenabsatz"/>
-        <w:numPr>
-          <w:ilvl w:val="1"/>
-          <w:numId w:val="1"/>
-        </w:numPr>
-        <w:rPr>
-          <w:lang w:val="en-GB"/>
-        </w:rPr>
-      </w:pPr>
-      <w:r>
-        <w:rPr>
-          <w:lang w:val="en-GB"/>
-        </w:rPr>
-        <w:t>command:</w:t>
-      </w:r>
-      <w:r>
-        <w:rPr>
-          <w:b/>
-          <w:bCs/>
-          <w:sz w:val="28"/>
-          <w:szCs w:val="28"/>
-          <w:lang w:val="en-GB"/>
-        </w:rPr>
-        <w:t xml:space="preserve"> </w:t>
-      </w:r>
-      <w:r>
-        <w:rPr>
-          <w:b/>
-          <w:bCs/>
-          <w:sz w:val="28"/>
-          <w:szCs w:val="28"/>
-          <w:lang w:val="en-GB"/>
-        </w:rPr>
-        <w:t>test</w:t>
-      </w:r>
-      <w:r>
-        <w:rPr>
-          <w:b/>
-          <w:bCs/>
-          <w:lang w:val="en-GB"/>
-        </w:rPr>
-        <w:br/>
-      </w:r>
-      <w:r>
-        <w:rPr>
-          <w:lang w:val="en-GB"/>
-        </w:rPr>
-        <w:t>sends test message to the backend</w:t>
-      </w:r>
-      <w:r>
-        <w:rPr>
-          <w:lang w:val="en-GB"/>
-        </w:rPr>
-        <w:t xml:space="preserve"> </w:t>
-      </w:r>
-      <w:r>
-        <w:rPr>
-          <w:lang w:val="en-GB"/>
-        </w:rPr>
-        <w:br/>
-      </w:r>
-    </w:p>
-    <w:p>
-      <w:pPr>
-        <w:pStyle w:val="Listenabsatz"/>
-        <w:numPr>
-          <w:ilvl w:val="1"/>
-          <w:numId w:val="1"/>
-        </w:numPr>
-        <w:rPr>
-          <w:lang w:val="en-GB"/>
-        </w:rPr>
-      </w:pPr>
-      <w:r>
-        <w:rPr>
-          <w:lang w:val="en-GB"/>
-        </w:rPr>
-        <w:t>com</w:t>
-      </w:r>
-      <w:r>
-        <w:rPr>
-          <w:lang w:val="en-GB"/>
-        </w:rPr>
-        <w:t>m</w:t>
-      </w:r>
-      <w:r>
-        <w:rPr>
-          <w:lang w:val="en-GB"/>
-        </w:rPr>
-        <w:t>and</w:t>
-      </w:r>
-      <w:r>
-        <w:rPr>
-          <w:lang w:val="en-GB"/>
-        </w:rPr>
-        <w:t>:</w:t>
-      </w:r>
-      <w:r>
-        <w:rPr>
-          <w:sz w:val="28"/>
-          <w:szCs w:val="28"/>
-          <w:lang w:val="en-GB"/>
-        </w:rPr>
-        <w:t xml:space="preserve"> </w:t>
-      </w:r>
-      <w:r>
-        <w:rPr>
-          <w:b/>
-          <w:bCs/>
-          <w:sz w:val="28"/>
-          <w:szCs w:val="28"/>
-          <w:lang w:val="en-GB"/>
-        </w:rPr>
-        <w:t>erase</w:t>
-      </w:r>
-      <w:r>
-        <w:rPr>
-          <w:lang w:val="en-GB"/>
-        </w:rPr>
-        <w:br/>
-      </w:r>
-      <w:r>
-        <w:rPr>
-          <w:lang w:val="en-GB"/>
-        </w:rPr>
-        <w:t xml:space="preserve">erases all </w:t>
-      </w:r>
-      <w:r>
-        <w:rPr>
-          <w:lang w:val="en-GB"/>
-        </w:rPr>
-        <w:t xml:space="preserve">configuration </w:t>
-      </w:r>
-      <w:r>
-        <w:rPr>
-          <w:lang w:val="en-GB"/>
-        </w:rPr>
-        <w:t>d</w:t>
-      </w:r>
-      <w:r>
-        <w:rPr>
-          <w:lang w:val="en-GB"/>
-        </w:rPr>
-        <w:t>ata from the permanent memory</w:t>
-      </w:r>
-      <w:r>
-        <w:rPr>
-          <w:lang w:val="en-GB"/>
-        </w:rPr>
-        <w:br/>
-      </w:r>
-      <w:r>
-        <w:rPr>
-          <w:b/>
-          <w:bCs/>
-          <w:lang w:val="en-GB"/>
-        </w:rPr>
-        <w:t xml:space="preserve">Also the </w:t>
-      </w:r>
-      <w:proofErr w:type="spellStart"/>
-      <w:r>
-        <w:rPr>
-          <w:b/>
-          <w:bCs/>
-          <w:lang w:val="en-GB"/>
-        </w:rPr>
-        <w:t>WiFi</w:t>
-      </w:r>
-      <w:proofErr w:type="spellEnd"/>
-      <w:r>
-        <w:rPr>
-          <w:b/>
-          <w:bCs/>
-          <w:lang w:val="en-GB"/>
-        </w:rPr>
-        <w:t xml:space="preserve"> access data</w:t>
+        <w:t xml:space="preserve">lists all </w:t>
+      </w:r>
+      <w:r>
+        <w:rPr>
+          <w:lang w:val="en-GB"/>
+        </w:rPr>
+        <w:t>commands</w:t>
       </w:r>
     </w:p>
     <w:p>
@@ -1071,13 +647,7 @@
         <w:rPr>
           <w:lang w:val="en-GB"/>
         </w:rPr>
-        <w:t>C</w:t>
-      </w:r>
-      <w:r>
-        <w:rPr>
-          <w:lang w:val="en-GB"/>
-        </w:rPr>
-        <w:t>om</w:t>
+        <w:t>com</w:t>
       </w:r>
       <w:r>
         <w:rPr>
@@ -1089,13 +659,7 @@
         <w:rPr>
           <w:lang w:val="en-GB"/>
         </w:rPr>
-        <w:t>and</w:t>
-      </w:r>
-      <w:r>
-        <w:rPr>
-          <w:lang w:val="en-GB"/>
-        </w:rPr>
-        <w:t xml:space="preserve"> (</w:t>
+        <w:t>and:</w:t>
       </w:r>
       <w:r>
         <w:rPr>
@@ -1105,7 +669,7 @@
           <w:szCs w:val="28"/>
           <w:lang w:val="en-GB"/>
         </w:rPr>
-        <w:t>change</w:t>
+        <w:t xml:space="preserve"> ex</w:t>
       </w:r>
       <w:r>
         <w:rPr>
@@ -1115,7 +679,7 @@
           <w:szCs w:val="28"/>
           <w:lang w:val="en-GB"/>
         </w:rPr>
-        <w:t xml:space="preserve"> </w:t>
+        <w:t>ample</w:t>
       </w:r>
       <w:r>
         <w:rPr>
@@ -1125,6 +689,18 @@
           <w:szCs w:val="28"/>
           <w:lang w:val="en-GB"/>
         </w:rPr>
+        <w:t xml:space="preserve"> </w:t>
+      </w:r>
+      <w:r>
+        <w:rPr>
+          <w:lang w:val="en-GB"/>
+        </w:rPr>
+        <w:t xml:space="preserve">(example </w:t>
+      </w:r>
+      <w:r>
+        <w:rPr>
+          <w:lang w:val="en-GB"/>
+        </w:rPr>
         <w:t>node ID</w:t>
       </w:r>
       <w:r>
@@ -1135,12 +711,8 @@
       </w:r>
       <w:r>
         <w:rPr>
-          <w:lang w:val="en-GB"/>
-        </w:rPr>
-        <w:t>:</w:t>
-      </w:r>
-      <w:r>
-        <w:rPr>
+          <w:b/>
+          <w:bCs/>
           <w:lang w:val="en-GB"/>
         </w:rPr>
         <w:br/>
@@ -1149,287 +721,25 @@
         <w:rPr>
           <w:lang w:val="en-GB"/>
         </w:rPr>
-        <w:t xml:space="preserve"> </w:t>
-      </w:r>
-      <w:r>
-        <w:rPr>
-          <w:b/>
-          <w:bCs/>
-          <w:sz w:val="28"/>
-          <w:szCs w:val="28"/>
-          <w:highlight w:val="yellow"/>
-          <w:lang w:val="en-GB"/>
-        </w:rPr>
-        <w:t>{</w:t>
-      </w:r>
-      <w:r>
-        <w:rPr>
-          <w:b/>
-          <w:bCs/>
-          <w:sz w:val="28"/>
-          <w:szCs w:val="28"/>
-          <w:highlight w:val="yellow"/>
-          <w:lang w:val="en-GB"/>
-        </w:rPr>
-        <w:t>“</w:t>
-      </w:r>
-      <w:proofErr w:type="spellStart"/>
-      <w:r>
-        <w:rPr>
-          <w:b/>
-          <w:bCs/>
-          <w:sz w:val="28"/>
-          <w:szCs w:val="28"/>
-          <w:highlight w:val="yellow"/>
-          <w:lang w:val="en-GB"/>
-        </w:rPr>
-        <w:t>nodeID</w:t>
-      </w:r>
-      <w:proofErr w:type="spellEnd"/>
-      <w:r>
-        <w:rPr>
-          <w:b/>
-          <w:bCs/>
-          <w:sz w:val="28"/>
-          <w:szCs w:val="28"/>
-          <w:highlight w:val="yellow"/>
-          <w:lang w:val="en-GB"/>
-        </w:rPr>
-        <w:t>”</w:t>
-      </w:r>
-      <w:r>
-        <w:rPr>
-          <w:b/>
-          <w:bCs/>
-          <w:sz w:val="28"/>
-          <w:szCs w:val="28"/>
-          <w:highlight w:val="yellow"/>
-          <w:lang w:val="en-GB"/>
-        </w:rPr>
-        <w:t>:</w:t>
-      </w:r>
-      <w:r>
-        <w:rPr>
-          <w:b/>
-          <w:bCs/>
-          <w:sz w:val="28"/>
-          <w:szCs w:val="28"/>
-          <w:highlight w:val="yellow"/>
-          <w:lang w:val="en-GB"/>
-        </w:rPr>
-        <w:t>”</w:t>
-      </w:r>
-      <w:r>
-        <w:rPr>
-          <w:i/>
-          <w:iCs/>
-          <w:sz w:val="28"/>
-          <w:szCs w:val="28"/>
-          <w:highlight w:val="yellow"/>
-          <w:lang w:val="en-GB"/>
-        </w:rPr>
-        <w:t>&lt;</w:t>
-      </w:r>
-      <w:proofErr w:type="spellStart"/>
-      <w:r>
-        <w:rPr>
-          <w:i/>
-          <w:iCs/>
-          <w:sz w:val="28"/>
-          <w:szCs w:val="28"/>
-          <w:highlight w:val="yellow"/>
-          <w:lang w:val="en-GB"/>
-        </w:rPr>
-        <w:t>a</w:t>
-      </w:r>
-      <w:r>
-        <w:rPr>
-          <w:i/>
-          <w:iCs/>
-          <w:sz w:val="28"/>
-          <w:szCs w:val="28"/>
-          <w:highlight w:val="yellow"/>
-          <w:lang w:val="en-GB"/>
-        </w:rPr>
-        <w:t>aaa</w:t>
-      </w:r>
-      <w:proofErr w:type="spellEnd"/>
-      <w:r>
-        <w:rPr>
-          <w:i/>
-          <w:iCs/>
-          <w:sz w:val="28"/>
-          <w:szCs w:val="28"/>
-          <w:highlight w:val="yellow"/>
-          <w:lang w:val="en-GB"/>
-        </w:rPr>
-        <w:t>&gt;</w:t>
-      </w:r>
-      <w:r>
-        <w:rPr>
-          <w:i/>
-          <w:iCs/>
-          <w:sz w:val="28"/>
-          <w:szCs w:val="28"/>
-          <w:highlight w:val="yellow"/>
-          <w:lang w:val="en-GB"/>
-        </w:rPr>
-        <w:t>”</w:t>
-      </w:r>
-      <w:r>
-        <w:rPr>
-          <w:b/>
-          <w:bCs/>
-          <w:sz w:val="28"/>
-          <w:szCs w:val="28"/>
-          <w:highlight w:val="yellow"/>
-          <w:lang w:val="en-GB"/>
-        </w:rPr>
-        <w:t>}</w:t>
-      </w:r>
-      <w:r>
-        <w:rPr>
-          <w:lang w:val="en-GB"/>
-        </w:rPr>
-        <w:br/>
-        <w:t>&lt;</w:t>
-      </w:r>
-      <w:proofErr w:type="spellStart"/>
-      <w:r>
-        <w:rPr>
-          <w:lang w:val="en-GB"/>
-        </w:rPr>
-        <w:t>a</w:t>
-      </w:r>
-      <w:r>
-        <w:rPr>
-          <w:lang w:val="en-GB"/>
-        </w:rPr>
-        <w:t>aaa</w:t>
-      </w:r>
-      <w:proofErr w:type="spellEnd"/>
-      <w:r>
-        <w:rPr>
-          <w:lang w:val="en-GB"/>
-        </w:rPr>
-        <w:t xml:space="preserve">&gt;: </w:t>
-      </w:r>
-      <w:proofErr w:type="spellStart"/>
-      <w:r>
-        <w:rPr>
-          <w:lang w:val="en-GB"/>
-        </w:rPr>
-        <w:t>nodeID</w:t>
-      </w:r>
-      <w:proofErr w:type="spellEnd"/>
-      <w:r>
-        <w:rPr>
-          <w:lang w:val="en-GB"/>
-        </w:rPr>
-        <w:br/>
-      </w:r>
-      <w:r>
-        <w:rPr>
-          <w:lang w:val="en-GB"/>
-        </w:rPr>
-        <w:t>complete example</w:t>
-      </w:r>
-      <w:r>
-        <w:rPr>
-          <w:lang w:val="en-GB"/>
-        </w:rPr>
-        <w:t xml:space="preserve">: </w:t>
-      </w:r>
-      <w:r>
-        <w:rPr>
-          <w:lang w:val="en-GB"/>
-        </w:rPr>
-        <w:br/>
-      </w:r>
-      <w:r>
-        <w:rPr>
-          <w:highlight w:val="yellow"/>
-          <w:lang w:val="en-GB"/>
-        </w:rPr>
-        <w:t>{</w:t>
-      </w:r>
-      <w:r>
-        <w:rPr>
-          <w:highlight w:val="yellow"/>
-          <w:lang w:val="en-GB"/>
-        </w:rPr>
-        <w:t>“</w:t>
-      </w:r>
-      <w:r>
-        <w:rPr>
-          <w:highlight w:val="yellow"/>
-          <w:lang w:val="en-GB"/>
-        </w:rPr>
-        <w:t>nodeID</w:t>
-      </w:r>
-      <w:r>
-        <w:rPr>
-          <w:highlight w:val="yellow"/>
-          <w:lang w:val="en-GB"/>
-        </w:rPr>
-        <w:t>”</w:t>
-      </w:r>
-      <w:r>
-        <w:rPr>
-          <w:highlight w:val="yellow"/>
-          <w:lang w:val="en-GB"/>
-        </w:rPr>
-        <w:t>:</w:t>
-      </w:r>
-      <w:r>
-        <w:rPr>
-          <w:highlight w:val="yellow"/>
-          <w:lang w:val="en-GB"/>
-        </w:rPr>
-        <w:t>”388D”</w:t>
-      </w:r>
-      <w:r>
-        <w:rPr>
-          <w:highlight w:val="yellow"/>
-          <w:lang w:val="en-GB"/>
-        </w:rPr>
-        <w:t>}</w:t>
-      </w:r>
-      <w:r>
-        <w:rPr>
-          <w:lang w:val="en-GB"/>
-        </w:rPr>
-        <w:br/>
-      </w:r>
-      <w:r>
-        <w:rPr>
-          <w:lang w:val="en-GB"/>
-        </w:rPr>
-        <w:t>Watch above how to get a</w:t>
-      </w:r>
-      <w:r>
-        <w:rPr>
-          <w:lang w:val="en-GB"/>
-        </w:rPr>
-        <w:t>n e</w:t>
-      </w:r>
-      <w:r>
-        <w:rPr>
-          <w:lang w:val="en-GB"/>
-        </w:rPr>
-        <w:t>xam</w:t>
-      </w:r>
-      <w:r>
-        <w:rPr>
-          <w:lang w:val="en-GB"/>
-        </w:rPr>
-        <w:t>p</w:t>
-      </w:r>
-      <w:r>
-        <w:rPr>
-          <w:lang w:val="en-GB"/>
-        </w:rPr>
-        <w:t>le</w:t>
+        <w:t xml:space="preserve">shows an example of </w:t>
+      </w:r>
+      <w:r>
+        <w:rPr>
+          <w:lang w:val="en-GB"/>
+        </w:rPr>
+        <w:t>the configuration of a node ID</w:t>
+      </w:r>
+      <w:r>
+        <w:rPr>
+          <w:lang w:val="en-GB"/>
+        </w:rPr>
+        <w:t xml:space="preserve">. </w:t>
+      </w:r>
+      <w:r>
+        <w:rPr>
+          <w:lang w:val="en-GB"/>
+        </w:rPr>
+        <w:t>Watch below</w:t>
       </w:r>
       <w:r>
         <w:rPr>
@@ -1452,6 +762,600 @@
           <w:numId w:val="1"/>
         </w:numPr>
         <w:rPr>
+          <w:lang w:val="en-GB"/>
+        </w:rPr>
+      </w:pPr>
+      <w:r>
+        <w:rPr>
+          <w:lang w:val="en-GB"/>
+        </w:rPr>
+        <w:t>command:</w:t>
+      </w:r>
+      <w:r>
+        <w:rPr>
+          <w:b/>
+          <w:bCs/>
+          <w:sz w:val="28"/>
+          <w:szCs w:val="28"/>
+          <w:lang w:val="en-GB"/>
+        </w:rPr>
+        <w:t xml:space="preserve"> reset</w:t>
+      </w:r>
+      <w:r>
+        <w:rPr>
+          <w:b/>
+          <w:bCs/>
+          <w:lang w:val="en-GB"/>
+        </w:rPr>
+        <w:br/>
+      </w:r>
+      <w:r>
+        <w:rPr>
+          <w:lang w:val="en-GB"/>
+        </w:rPr>
+        <w:t xml:space="preserve">resets </w:t>
+      </w:r>
+      <w:r>
+        <w:rPr>
+          <w:lang w:val="en-GB"/>
+        </w:rPr>
+        <w:t>the receiver</w:t>
+      </w:r>
+      <w:r>
+        <w:rPr>
+          <w:lang w:val="en-GB"/>
+        </w:rPr>
+        <w:t xml:space="preserve"> </w:t>
+      </w:r>
+      <w:r>
+        <w:rPr>
+          <w:lang w:val="en-GB"/>
+        </w:rPr>
+        <w:br/>
+      </w:r>
+    </w:p>
+    <w:p>
+      <w:pPr>
+        <w:pStyle w:val="Listenabsatz"/>
+        <w:numPr>
+          <w:ilvl w:val="1"/>
+          <w:numId w:val="1"/>
+        </w:numPr>
+        <w:rPr>
+          <w:lang w:val="en-GB"/>
+        </w:rPr>
+      </w:pPr>
+      <w:r>
+        <w:rPr>
+          <w:lang w:val="en-GB"/>
+        </w:rPr>
+        <w:t>command:</w:t>
+      </w:r>
+      <w:r>
+        <w:rPr>
+          <w:b/>
+          <w:bCs/>
+          <w:sz w:val="28"/>
+          <w:szCs w:val="28"/>
+          <w:lang w:val="en-GB"/>
+        </w:rPr>
+        <w:t xml:space="preserve"> </w:t>
+      </w:r>
+      <w:r>
+        <w:rPr>
+          <w:b/>
+          <w:bCs/>
+          <w:sz w:val="28"/>
+          <w:szCs w:val="28"/>
+          <w:lang w:val="en-GB"/>
+        </w:rPr>
+        <w:t>test</w:t>
+      </w:r>
+      <w:r>
+        <w:rPr>
+          <w:b/>
+          <w:bCs/>
+          <w:lang w:val="en-GB"/>
+        </w:rPr>
+        <w:br/>
+      </w:r>
+      <w:r>
+        <w:rPr>
+          <w:lang w:val="en-GB"/>
+        </w:rPr>
+        <w:t>sends test message to the backend</w:t>
+      </w:r>
+      <w:r>
+        <w:rPr>
+          <w:lang w:val="en-GB"/>
+        </w:rPr>
+        <w:t xml:space="preserve"> </w:t>
+      </w:r>
+      <w:r>
+        <w:rPr>
+          <w:lang w:val="en-GB"/>
+        </w:rPr>
+        <w:br/>
+      </w:r>
+    </w:p>
+    <w:p>
+      <w:pPr>
+        <w:pStyle w:val="Listenabsatz"/>
+        <w:numPr>
+          <w:ilvl w:val="1"/>
+          <w:numId w:val="1"/>
+        </w:numPr>
+        <w:rPr>
+          <w:lang w:val="en-GB"/>
+        </w:rPr>
+      </w:pPr>
+      <w:r>
+        <w:rPr>
+          <w:lang w:val="en-GB"/>
+        </w:rPr>
+        <w:t>com</w:t>
+      </w:r>
+      <w:r>
+        <w:rPr>
+          <w:lang w:val="en-GB"/>
+        </w:rPr>
+        <w:t>m</w:t>
+      </w:r>
+      <w:r>
+        <w:rPr>
+          <w:lang w:val="en-GB"/>
+        </w:rPr>
+        <w:t>and</w:t>
+      </w:r>
+      <w:r>
+        <w:rPr>
+          <w:lang w:val="en-GB"/>
+        </w:rPr>
+        <w:t>:</w:t>
+      </w:r>
+      <w:r>
+        <w:rPr>
+          <w:sz w:val="28"/>
+          <w:szCs w:val="28"/>
+          <w:lang w:val="en-GB"/>
+        </w:rPr>
+        <w:t xml:space="preserve"> </w:t>
+      </w:r>
+      <w:r>
+        <w:rPr>
+          <w:b/>
+          <w:bCs/>
+          <w:sz w:val="28"/>
+          <w:szCs w:val="28"/>
+          <w:lang w:val="en-GB"/>
+        </w:rPr>
+        <w:t>erase</w:t>
+      </w:r>
+      <w:r>
+        <w:rPr>
+          <w:lang w:val="en-GB"/>
+        </w:rPr>
+        <w:br/>
+      </w:r>
+      <w:r>
+        <w:rPr>
+          <w:lang w:val="en-GB"/>
+        </w:rPr>
+        <w:t xml:space="preserve">erases all </w:t>
+      </w:r>
+      <w:r>
+        <w:rPr>
+          <w:lang w:val="en-GB"/>
+        </w:rPr>
+        <w:t xml:space="preserve">configuration </w:t>
+      </w:r>
+      <w:r>
+        <w:rPr>
+          <w:lang w:val="en-GB"/>
+        </w:rPr>
+        <w:t>d</w:t>
+      </w:r>
+      <w:r>
+        <w:rPr>
+          <w:lang w:val="en-GB"/>
+        </w:rPr>
+        <w:t>ata from the permanent memory</w:t>
+      </w:r>
+      <w:r>
+        <w:rPr>
+          <w:lang w:val="en-GB"/>
+        </w:rPr>
+        <w:br/>
+      </w:r>
+      <w:r>
+        <w:rPr>
+          <w:b/>
+          <w:bCs/>
+          <w:lang w:val="en-GB"/>
+        </w:rPr>
+        <w:t>Also the WiFi access data</w:t>
+      </w:r>
+    </w:p>
+    <w:p>
+      <w:pPr>
+        <w:pStyle w:val="Listenabsatz"/>
+        <w:ind w:left="1440"/>
+        <w:rPr>
+          <w:lang w:val="en-GB"/>
+        </w:rPr>
+      </w:pPr>
+    </w:p>
+    <w:p>
+      <w:pPr>
+        <w:pStyle w:val="Listenabsatz"/>
+        <w:numPr>
+          <w:ilvl w:val="1"/>
+          <w:numId w:val="1"/>
+        </w:numPr>
+        <w:rPr>
+          <w:lang w:val="en-GB"/>
+        </w:rPr>
+      </w:pPr>
+      <w:r>
+        <w:rPr>
+          <w:lang w:val="en-GB"/>
+        </w:rPr>
+        <w:t>C</w:t>
+      </w:r>
+      <w:r>
+        <w:rPr>
+          <w:lang w:val="en-GB"/>
+        </w:rPr>
+        <w:t>om</w:t>
+      </w:r>
+      <w:r>
+        <w:rPr>
+          <w:lang w:val="en-GB"/>
+        </w:rPr>
+        <w:t>m</w:t>
+      </w:r>
+      <w:r>
+        <w:rPr>
+          <w:lang w:val="en-GB"/>
+        </w:rPr>
+        <w:t>and</w:t>
+      </w:r>
+      <w:r>
+        <w:rPr>
+          <w:lang w:val="en-GB"/>
+        </w:rPr>
+        <w:t xml:space="preserve"> (</w:t>
+      </w:r>
+      <w:r>
+        <w:rPr>
+          <w:b/>
+          <w:bCs/>
+          <w:sz w:val="28"/>
+          <w:szCs w:val="28"/>
+          <w:lang w:val="en-GB"/>
+        </w:rPr>
+        <w:t>change</w:t>
+      </w:r>
+      <w:r>
+        <w:rPr>
+          <w:b/>
+          <w:bCs/>
+          <w:sz w:val="28"/>
+          <w:szCs w:val="28"/>
+          <w:lang w:val="en-GB"/>
+        </w:rPr>
+        <w:t xml:space="preserve"> </w:t>
+      </w:r>
+      <w:r>
+        <w:rPr>
+          <w:b/>
+          <w:bCs/>
+          <w:sz w:val="28"/>
+          <w:szCs w:val="28"/>
+          <w:lang w:val="en-GB"/>
+        </w:rPr>
+        <w:t>node ID</w:t>
+      </w:r>
+      <w:r>
+        <w:rPr>
+          <w:lang w:val="en-GB"/>
+        </w:rPr>
+        <w:t>)</w:t>
+      </w:r>
+      <w:r>
+        <w:rPr>
+          <w:lang w:val="en-GB"/>
+        </w:rPr>
+        <w:t>:</w:t>
+      </w:r>
+      <w:r>
+        <w:rPr>
+          <w:lang w:val="en-GB"/>
+        </w:rPr>
+        <w:br/>
+      </w:r>
+      <w:r>
+        <w:rPr>
+          <w:lang w:val="en-GB"/>
+        </w:rPr>
+        <w:t xml:space="preserve"> </w:t>
+      </w:r>
+      <w:r>
+        <w:rPr>
+          <w:b/>
+          <w:bCs/>
+          <w:sz w:val="28"/>
+          <w:szCs w:val="28"/>
+          <w:highlight w:val="yellow"/>
+          <w:lang w:val="en-GB"/>
+        </w:rPr>
+        <w:t>{</w:t>
+      </w:r>
+      <w:r>
+        <w:rPr>
+          <w:b/>
+          <w:bCs/>
+          <w:sz w:val="28"/>
+          <w:szCs w:val="28"/>
+          <w:highlight w:val="yellow"/>
+          <w:lang w:val="en-GB"/>
+        </w:rPr>
+        <w:t>“</w:t>
+      </w:r>
+      <w:r>
+        <w:rPr>
+          <w:b/>
+          <w:bCs/>
+          <w:sz w:val="28"/>
+          <w:szCs w:val="28"/>
+          <w:highlight w:val="yellow"/>
+          <w:lang w:val="en-GB"/>
+        </w:rPr>
+        <w:t>nodeID</w:t>
+      </w:r>
+      <w:r>
+        <w:rPr>
+          <w:b/>
+          <w:bCs/>
+          <w:sz w:val="28"/>
+          <w:szCs w:val="28"/>
+          <w:highlight w:val="yellow"/>
+          <w:lang w:val="en-GB"/>
+        </w:rPr>
+        <w:t>”</w:t>
+      </w:r>
+      <w:r>
+        <w:rPr>
+          <w:b/>
+          <w:bCs/>
+          <w:sz w:val="28"/>
+          <w:szCs w:val="28"/>
+          <w:highlight w:val="yellow"/>
+          <w:lang w:val="en-GB"/>
+        </w:rPr>
+        <w:t>:</w:t>
+      </w:r>
+      <w:r>
+        <w:rPr>
+          <w:b/>
+          <w:bCs/>
+          <w:sz w:val="28"/>
+          <w:szCs w:val="28"/>
+          <w:highlight w:val="yellow"/>
+          <w:lang w:val="en-GB"/>
+        </w:rPr>
+        <w:t>”</w:t>
+      </w:r>
+      <w:r>
+        <w:rPr>
+          <w:i/>
+          <w:iCs/>
+          <w:sz w:val="28"/>
+          <w:szCs w:val="28"/>
+          <w:highlight w:val="yellow"/>
+          <w:lang w:val="en-GB"/>
+        </w:rPr>
+        <w:t>&lt;a</w:t>
+      </w:r>
+      <w:r>
+        <w:rPr>
+          <w:i/>
+          <w:iCs/>
+          <w:sz w:val="28"/>
+          <w:szCs w:val="28"/>
+          <w:highlight w:val="yellow"/>
+          <w:lang w:val="en-GB"/>
+        </w:rPr>
+        <w:t>aaa</w:t>
+      </w:r>
+      <w:r>
+        <w:rPr>
+          <w:i/>
+          <w:iCs/>
+          <w:sz w:val="28"/>
+          <w:szCs w:val="28"/>
+          <w:highlight w:val="yellow"/>
+          <w:lang w:val="en-GB"/>
+        </w:rPr>
+        <w:t>&gt;</w:t>
+      </w:r>
+      <w:r>
+        <w:rPr>
+          <w:i/>
+          <w:iCs/>
+          <w:sz w:val="28"/>
+          <w:szCs w:val="28"/>
+          <w:highlight w:val="yellow"/>
+          <w:lang w:val="en-GB"/>
+        </w:rPr>
+        <w:t>”</w:t>
+      </w:r>
+      <w:r>
+        <w:rPr>
+          <w:b/>
+          <w:bCs/>
+          <w:sz w:val="28"/>
+          <w:szCs w:val="28"/>
+          <w:highlight w:val="yellow"/>
+          <w:lang w:val="en-GB"/>
+        </w:rPr>
+        <w:t>}</w:t>
+      </w:r>
+      <w:r>
+        <w:rPr>
+          <w:lang w:val="en-GB"/>
+        </w:rPr>
+        <w:br/>
+        <w:t>&lt;a</w:t>
+      </w:r>
+      <w:r>
+        <w:rPr>
+          <w:lang w:val="en-GB"/>
+        </w:rPr>
+        <w:t>aaa</w:t>
+      </w:r>
+      <w:r>
+        <w:rPr>
+          <w:lang w:val="en-GB"/>
+        </w:rPr>
+        <w:t xml:space="preserve">&gt;: </w:t>
+      </w:r>
+      <w:r>
+        <w:rPr>
+          <w:lang w:val="en-GB"/>
+        </w:rPr>
+        <w:t>nodeID</w:t>
+      </w:r>
+      <w:r>
+        <w:rPr>
+          <w:lang w:val="en-GB"/>
+        </w:rPr>
+        <w:br/>
+      </w:r>
+      <w:r>
+        <w:rPr>
+          <w:lang w:val="en-GB"/>
+        </w:rPr>
+        <w:t>complete example</w:t>
+      </w:r>
+      <w:r>
+        <w:rPr>
+          <w:lang w:val="en-GB"/>
+        </w:rPr>
+        <w:t xml:space="preserve">: </w:t>
+      </w:r>
+      <w:r>
+        <w:rPr>
+          <w:lang w:val="en-GB"/>
+        </w:rPr>
+        <w:br/>
+      </w:r>
+      <w:r>
+        <w:rPr>
+          <w:highlight w:val="yellow"/>
+          <w:lang w:val="en-GB"/>
+        </w:rPr>
+        <w:t>{</w:t>
+      </w:r>
+      <w:r>
+        <w:rPr>
+          <w:highlight w:val="yellow"/>
+          <w:lang w:val="en-GB"/>
+        </w:rPr>
+        <w:t>“</w:t>
+      </w:r>
+      <w:r>
+        <w:rPr>
+          <w:highlight w:val="yellow"/>
+          <w:lang w:val="en-GB"/>
+        </w:rPr>
+        <w:t>nodeID</w:t>
+      </w:r>
+      <w:r>
+        <w:rPr>
+          <w:highlight w:val="yellow"/>
+          <w:lang w:val="en-GB"/>
+        </w:rPr>
+        <w:t>”</w:t>
+      </w:r>
+      <w:r>
+        <w:rPr>
+          <w:highlight w:val="yellow"/>
+          <w:lang w:val="en-GB"/>
+        </w:rPr>
+        <w:t>:</w:t>
+      </w:r>
+      <w:r>
+        <w:rPr>
+          <w:highlight w:val="yellow"/>
+          <w:lang w:val="en-GB"/>
+        </w:rPr>
+        <w:t>”388D”</w:t>
+      </w:r>
+      <w:r>
+        <w:rPr>
+          <w:highlight w:val="yellow"/>
+          <w:lang w:val="en-GB"/>
+        </w:rPr>
+        <w:t>}</w:t>
+      </w:r>
+      <w:r>
+        <w:rPr>
+          <w:lang w:val="en-GB"/>
+        </w:rPr>
+        <w:br/>
+      </w:r>
+      <w:r>
+        <w:rPr>
+          <w:lang w:val="en-GB"/>
+        </w:rPr>
+        <w:t>Watch above how to get a</w:t>
+      </w:r>
+      <w:r>
+        <w:rPr>
+          <w:lang w:val="en-GB"/>
+        </w:rPr>
+        <w:t>n e</w:t>
+      </w:r>
+      <w:r>
+        <w:rPr>
+          <w:lang w:val="en-GB"/>
+        </w:rPr>
+        <w:t>xam</w:t>
+      </w:r>
+      <w:r>
+        <w:rPr>
+          <w:lang w:val="en-GB"/>
+        </w:rPr>
+        <w:t>p</w:t>
+      </w:r>
+      <w:r>
+        <w:rPr>
+          <w:lang w:val="en-GB"/>
+        </w:rPr>
+        <w:t>le</w:t>
+      </w:r>
+      <w:r>
+        <w:rPr>
+          <w:lang w:val="en-GB"/>
+        </w:rPr>
+        <w:t>.</w:t>
+      </w:r>
+      <w:r>
+        <w:rPr>
+          <w:lang w:val="en-GB"/>
+        </w:rPr>
+        <w:br/>
+      </w:r>
+    </w:p>
+    <w:p>
+      <w:pPr>
+        <w:pStyle w:val="Listenabsatz"/>
+        <w:numPr>
+          <w:ilvl w:val="1"/>
+          <w:numId w:val="1"/>
+        </w:numPr>
+        <w:rPr>
           <w:lang w:val="it-IT"/>
         </w:rPr>
       </w:pPr>
@@ -1493,16 +1397,8 @@
         <w:rPr>
           <w:lang w:val="it-IT"/>
         </w:rPr>
-        <w:t xml:space="preserve"> </w:t>
-      </w:r>
-      <w:proofErr w:type="spellStart"/>
-      <w:r>
-        <w:rPr>
-          <w:lang w:val="it-IT"/>
-        </w:rPr>
-        <w:t>version</w:t>
-      </w:r>
-      <w:proofErr w:type="spellEnd"/>
+        <w:t xml:space="preserve"> version</w:t>
+      </w:r>
       <w:r>
         <w:rPr>
           <w:lang w:val="it-IT"/>

</xml_diff>